<commit_message>
Add DOI verified Chinese advantages Word manuscript
</commit_message>
<xml_diff>
--- a/manuscript/SnowLotus_CellFM_chinese_paper_model_functions_advantages_v0_5.docx
+++ b/manuscript/SnowLotus_CellFM_chinese_paper_model_functions_advantages_v0_5.docx
@@ -39,7 +39,7 @@
           <w:b w:val="0"/>
           <w:sz w:val="19"/>
         </w:rPr>
-        <w:t>生成时间：2026-07-27 01:15 Asia/Shanghai</w:t>
+        <w:t>生成时间：2026-07-27 01:22 Asia/Shanghai</w:t>
       </w:r>
     </w:p>
     <w:p>
@@ -1915,7 +1915,7 @@
           <w:b w:val="0"/>
           <w:sz w:val="21"/>
         </w:rPr>
-        <w:t>Cui H. et al. scGPT: toward building a foundation model for single-cell multi-omics using generative AI. Nature Methods, 2024.</w:t>
+        <w:t>Cui H. et al. scGPT: toward building a foundation model for single-cell multi-omics using generative AI. Nature Methods 21, 1470-1480, 2024. DOI: 10.1038/s41592-024-02201-0.</w:t>
       </w:r>
     </w:p>
     <w:p>
@@ -1929,7 +1929,7 @@
           <w:b w:val="0"/>
           <w:sz w:val="21"/>
         </w:rPr>
-        <w:t>Hao M. et al. Large-scale foundation model on single-cell transcriptomics. Nature Methods, 2024.</w:t>
+        <w:t>Hao M. et al. Large-scale foundation model on single-cell transcriptomics. Nature Methods 21, 1481-1491, 2024. DOI: 10.1038/s41592-024-02305-7.</w:t>
       </w:r>
     </w:p>
     <w:p>
@@ -1943,7 +1943,7 @@
           <w:b w:val="0"/>
           <w:sz w:val="21"/>
         </w:rPr>
-        <w:t>Chen S. et al. scPlant: A versatile framework for single-cell transcriptomic data analysis in plants. Plant Communications, 2023.</w:t>
+        <w:t>Cao S. et al. scPlant: A versatile framework for single-cell transcriptomic data analysis in plants. Plant Communications 4, 100631, 2023. DOI: 10.1016/j.xplc.2023.100631.</w:t>
       </w:r>
     </w:p>
     <w:p>
@@ -1957,7 +1957,7 @@
           <w:b w:val="0"/>
           <w:sz w:val="21"/>
         </w:rPr>
-        <w:t>Cao G. et al. scPlantLLM: A Foundation Model for Exploring Single-cell Expression Atlases in Plants. Genomics, Proteomics &amp; Bioinformatics, 2025.</w:t>
+        <w:t>Cao G. et al. scPlantLLM: A Foundation Model for Exploring Single-cell Expression Atlases in Plants. Genomics, Proteomics &amp; Bioinformatics 23, qzaf024, 2025. DOI: 10.1093/gpbjnl/qzaf024.</w:t>
       </w:r>
     </w:p>
     <w:p>
@@ -1971,7 +1971,7 @@
           <w:b w:val="0"/>
           <w:sz w:val="21"/>
         </w:rPr>
-        <w:t>Lu C. et al. scPlantAnnotate: an accurate and robust transformer-based model for plant cell type annotation. Journal of Advanced Research, 2026.</w:t>
+        <w:t>Lu C. et al. scPlantAnnotate: an accurate and robust transformer-based model for plant cell type annotation. Journal of Advanced Research, 2026. DOI: 10.1016/j.jare.2026.01.035.</w:t>
       </w:r>
     </w:p>
     <w:sectPr>

</xml_diff>

<commit_message>
Publish validated Chinese manuscript DOCX
</commit_message>
<xml_diff>
--- a/manuscript/SnowLotus_CellFM_chinese_paper_model_functions_advantages_v0_5.docx
+++ b/manuscript/SnowLotus_CellFM_chinese_paper_model_functions_advantages_v0_5.docx
@@ -39,7 +39,7 @@
           <w:b w:val="0"/>
           <w:sz w:val="19"/>
         </w:rPr>
-        <w:t>生成时间：2026-07-27 01:22 Asia/Shanghai</w:t>
+        <w:t>生成时间：2026-07-27 01:32 Asia/Shanghai</w:t>
       </w:r>
     </w:p>
     <w:p>
@@ -102,7 +102,7 @@
           <w:b w:val="0"/>
           <w:sz w:val="21"/>
         </w:rPr>
-        <w:t>60e683a84068e5ad5f2ff6ce6f9f4a5bbc6bbdec</w:t>
+        <w:t>editor-v0.3 (release tag)</w:t>
       </w:r>
     </w:p>
     <w:p>
@@ -400,7 +400,7 @@
         <w:tc>
           <w:tcPr>
             <w:tcW w:type="dxa" w:w="3249"/>
-            <w:shd w:fill="D9EAF7"/>
+            <w:shd w:val="clear" w:fill="D9EAF7"/>
           </w:tcPr>
           <w:p>
             <w:pPr>
@@ -420,7 +420,7 @@
         <w:tc>
           <w:tcPr>
             <w:tcW w:type="dxa" w:w="3249"/>
-            <w:shd w:fill="D9EAF7"/>
+            <w:shd w:val="clear" w:fill="D9EAF7"/>
           </w:tcPr>
           <w:p>
             <w:pPr>
@@ -440,7 +440,7 @@
         <w:tc>
           <w:tcPr>
             <w:tcW w:type="dxa" w:w="3249"/>
-            <w:shd w:fill="D9EAF7"/>
+            <w:shd w:val="clear" w:fill="D9EAF7"/>
           </w:tcPr>
           <w:p>
             <w:pPr>
@@ -868,7 +868,7 @@
         <w:tc>
           <w:tcPr>
             <w:tcW w:type="dxa" w:w="3249"/>
-            <w:shd w:fill="D9EAF7"/>
+            <w:shd w:val="clear" w:fill="D9EAF7"/>
           </w:tcPr>
           <w:p>
             <w:pPr>
@@ -888,7 +888,7 @@
         <w:tc>
           <w:tcPr>
             <w:tcW w:type="dxa" w:w="3249"/>
-            <w:shd w:fill="D9EAF7"/>
+            <w:shd w:val="clear" w:fill="D9EAF7"/>
           </w:tcPr>
           <w:p>
             <w:pPr>
@@ -908,7 +908,7 @@
         <w:tc>
           <w:tcPr>
             <w:tcW w:type="dxa" w:w="3249"/>
-            <w:shd w:fill="D9EAF7"/>
+            <w:shd w:val="clear" w:fill="D9EAF7"/>
           </w:tcPr>
           <w:p>
             <w:pPr>
@@ -1248,7 +1248,7 @@
           <w:b w:val="0"/>
           <w:sz w:val="21"/>
         </w:rPr>
-        <w:t>当前版本已经完成代码仓库与提交包整理。代码地址为 GitHub 仓库：https://github.com/ahvsjags/SnowLotus-CellFM。Release tag 为：https://github.com/ahvsjags/SnowLotus-CellFM/releases/tag/editor-v0.3。最新同步 commit 为：60e683a84068e5ad5f2ff6ce6f9f4a5bbc6bbdec。提交包文件为：SnowLotus-CellFM_editor-v0.3_submit-now.zip。仓库中包含 src、configs、scripts、tests、manuscript、release_metadata 和 models 等目录，覆盖模型训练、语料构建、预测导出、数据审计和编辑材料生成。</w:t>
+        <w:t>当前版本已经完成代码仓库与提交包整理。代码地址为 GitHub 仓库：https://github.com/ahvsjags/SnowLotus-CellFM。Release tag 为：https://github.com/ahvsjags/SnowLotus-CellFM/releases/tag/editor-v0.3。最新同步 commit 为：editor-v0.3 (release tag)。提交包文件为：SnowLotus-CellFM_editor-v0.3_submit-now.zip。仓库中包含 src、configs、scripts、tests、manuscript、release_metadata 和 models 等目录，覆盖模型训练、语料构建、预测导出、数据审计和编辑材料生成。</w:t>
       </w:r>
     </w:p>
     <w:p>
@@ -1322,7 +1322,7 @@
         <w:tc>
           <w:tcPr>
             <w:tcW w:type="dxa" w:w="3249"/>
-            <w:shd w:fill="D9EAF7"/>
+            <w:shd w:val="clear" w:fill="D9EAF7"/>
           </w:tcPr>
           <w:p>
             <w:pPr>
@@ -1342,7 +1342,7 @@
         <w:tc>
           <w:tcPr>
             <w:tcW w:type="dxa" w:w="3249"/>
-            <w:shd w:fill="D9EAF7"/>
+            <w:shd w:val="clear" w:fill="D9EAF7"/>
           </w:tcPr>
           <w:p>
             <w:pPr>
@@ -1362,7 +1362,7 @@
         <w:tc>
           <w:tcPr>
             <w:tcW w:type="dxa" w:w="3249"/>
-            <w:shd w:fill="D9EAF7"/>
+            <w:shd w:val="clear" w:fill="D9EAF7"/>
           </w:tcPr>
           <w:p>
             <w:pPr>
@@ -1824,7 +1824,7 @@
           <w:b w:val="0"/>
           <w:sz w:val="21"/>
         </w:rPr>
-        <w:t>60e683a84068e5ad5f2ff6ce6f9f4a5bbc6bbdec</w:t>
+        <w:t>editor-v0.3 (release tag)</w:t>
       </w:r>
     </w:p>
     <w:p>

</xml_diff>